<commit_message>
speed up on doc analysis
</commit_message>
<xml_diff>
--- a/fixtures/letter_de.anonymized.docx
+++ b/fixtures/letter_de.anonymized.docx
@@ -14,13 +14,13 @@
     </w:p>
     <w:p>
       <w:r>
-        <w:t xml:space="preserve">[LOCATION_1]</w:t>
+        <w:t xml:space="preserve">[ADDRESS_2]</w:t>
       </w:r>
     </w:p>
     <w:p/>
     <w:p>
       <w:r>
-        <w:t xml:space="preserve">[LOCATION_2], 15. Oktober 2026</w:t>
+        <w:t xml:space="preserve">[LOCATION_1], [DATE_OF_BIRTH_1]</w:t>
       </w:r>
     </w:p>
     <w:p/>
@@ -40,7 +40,7 @@
     <w:p/>
     <w:p>
       <w:r>
-        <w:t xml:space="preserve">vielen Dank für Ihr Schreiben vom 3. Oktober. Wie mit [PERSON_2] besprochen, haben wir Ihre Kundennummer [CUSTOMER_NUMBER_1] im System hinterlegt. Ihre Angaben: geboren am [DATE_OF_BIRTH_1], wohnhaft in der [ADDRESS_2].</w:t>
+        <w:t xml:space="preserve">vielen Dank für Ihr Schreiben vom 3. Oktober. Wie mit [PERSON_2] besprochen, haben wir Ihre Kundennummer [CUSTOMER_NUMBER_1] im System hinterlegt. Ihre Angaben: geboren am [DATE_OF_BIRTH_2], wohnhaft in der [ADDRESS_3].</w:t>
       </w:r>
       <w:r>
         <w:rPr>
@@ -58,7 +58,16 @@
     <w:p/>
     <w:p>
       <w:r>
-        <w:t xml:space="preserve">[PERSON_3] hat zudem gebeten, seine Steuer-ID [TAX_NUMBER_1] zu vermerken.</w:t>
+        <w:t xml:space="preserve">Herr </w:t>
+      </w:r>
+      <w:r>
+        <w:rPr>
+          <w:b/>
+        </w:rPr>
+        <w:t xml:space="preserve">[PERSON_3]</w:t>
+      </w:r>
+      <w:r>
+        <w:t xml:space="preserve"> hat zudem gebeten, seine Steuer-ID [TAX_NUMBER_1] zu vermerken.</w:t>
       </w:r>
     </w:p>
     <w:p/>
@@ -95,7 +104,7 @@
           </w:tcPr>
           <w:p>
             <w:r>
-              <w:t xml:space="preserve">[PERSON_4]</w:t>
+              <w:t xml:space="preserve">Kunde</w:t>
             </w:r>
           </w:p>
         </w:tc>
@@ -117,7 +126,7 @@
           </w:tcPr>
           <w:p>
             <w:r>
-              <w:t xml:space="preserve">[IBAN_2]</w:t>
+              <w:t xml:space="preserve">IBAN</w:t>
             </w:r>
           </w:p>
         </w:tc>

</xml_diff>